<commit_message>
Clarify web filtering fix: default-deny egress closes the reverse-connection gap
Adds a worked-example callout showing how a malware reverse
connection can succeed even under category/reputation-based
filtering (the callback destination has never been flagged), and
reframes the recommendation around a default-deny (allow-list)
outbound model as the primary fix, with NRD blocking, real-time
threat intel, and DNS filtering as complementary layers.

Co-Authored-By: Claude Sonnet 5 <noreply@anthropic.com>
Claude-Session: https://claude.ai/code/session_01GDWWgBSNDi29uHfMv5BR4C
</commit_message>
<xml_diff>
--- a/reports/Security_Policy_Recommendations.docx
+++ b/reports/Security_Policy_Recommendations.docx
@@ -312,7 +312,7 @@
           <w:sz w:val="22"/>
           <w:szCs w:val="22"/>
         </w:rPr>
-        <w:t xml:space="preserve">During my initial review of our security posture, I identified two gaps that create real, measurable risk to the organization: (1) our web filtering model allows all traffic by default and only blocks known-bad sites, leaving newly registered and uncategorized malicious domains free to reach users; and (2) we have no policy or reporting mechanism covering unattended, unlocked workstations or the use of shared logins, which breaks accountability and opens an easy path to data exposure.</w:t>
+        <w:t xml:space="preserve">During my initial review of our security posture, I identified two gaps that create real, measurable risk to the organization: (1) our web filtering model allows all traffic by default and only blocks known-bad sites, leaving newly registered and uncategorized malicious domains — and outbound malware callbacks that were never categorized in the first place — free to reach or leave the network; and (2) we have no policy or reporting mechanism covering unattended, unlocked workstations or the use of shared logins, which breaks accountability and opens an easy path to data exposure.</w:t>
       </w:r>
     </w:p>
     <w:p>
@@ -531,7 +531,7 @@
                 <w:sz w:val="20"/>
                 <w:szCs w:val="20"/>
               </w:rPr>
-              <w:t xml:space="preserve">Default-allow model; unclassified/new malicious domains reach users</w:t>
+              <w:t xml:space="preserve">Default-allow model; unclassified domains and malware reverse connections are not blocked</w:t>
             </w:r>
           </w:p>
         </w:tc>
@@ -843,6 +843,144 @@
     </w:p>
     <w:p>
       <w:pPr>
+        <w:spacing w:after="120" w:before="60"/>
+      </w:pPr>
+    </w:p>
+    <w:tbl>
+      <w:tblPr>
+        <w:tblW w:type="dxa" w:w="9500"/>
+        <w:tblBorders>
+          <w:top w:val="single" w:color="C00000" w:sz="8"/>
+          <w:left w:val="single" w:color="C00000" w:sz="8"/>
+          <w:bottom w:val="single" w:color="C00000" w:sz="8"/>
+          <w:right w:val="single" w:color="C00000" w:sz="8"/>
+          <w:insideH w:val="single" w:color="auto" w:sz="4"/>
+          <w:insideV w:val="single" w:color="auto" w:sz="4"/>
+        </w:tblBorders>
+      </w:tblPr>
+      <w:tblGrid>
+        <w:gridCol w:w="9500"/>
+      </w:tblGrid>
+      <w:tr>
+        <w:tc>
+          <w:tcPr>
+            <w:tcW w:type="dxa" w:w="9500"/>
+            <w:shd w:fill="FDEDEC" w:color="auto" w:val="clear"/>
+            <w:tcMar>
+              <w:top w:type="dxa" w:w="160"/>
+              <w:left w:type="dxa" w:w="220"/>
+              <w:bottom w:type="dxa" w:w="160"/>
+              <w:right w:type="dxa" w:w="220"/>
+            </w:tcMar>
+          </w:tcPr>
+          <w:p>
+            <w:pPr>
+              <w:spacing w:after="90"/>
+            </w:pPr>
+            <w:r>
+              <w:rPr>
+                <w:b/>
+                <w:bCs/>
+                <w:color w:val="C00000"/>
+                <w:sz w:val="22"/>
+                <w:szCs w:val="22"/>
+              </w:rPr>
+              <w:t xml:space="preserve">Worked example: this can happen through a site the filter never blocked</w:t>
+            </w:r>
+          </w:p>
+          <w:p>
+            <w:pPr>
+              <w:pStyle w:val="ListParagraph"/>
+              <w:numPr>
+                <w:ilvl w:val="0"/>
+                <w:numId w:val="3"/>
+              </w:numPr>
+              <w:spacing w:after="70" w:line="268"/>
+            </w:pPr>
+            <w:r>
+              <w:rPr>
+                <w:sz w:val="22"/>
+                <w:szCs w:val="22"/>
+              </w:rPr>
+              <w:t xml:space="preserve">A user visits a site that is not on any block list and is not miscategorized — nothing about it looks suspicious, because at that moment nothing about it is known to be bad.</w:t>
+            </w:r>
+          </w:p>
+          <w:p>
+            <w:pPr>
+              <w:pStyle w:val="ListParagraph"/>
+              <w:numPr>
+                <w:ilvl w:val="0"/>
+                <w:numId w:val="3"/>
+              </w:numPr>
+              <w:spacing w:after="70" w:line="268"/>
+            </w:pPr>
+            <w:r>
+              <w:rPr>
+                <w:sz w:val="22"/>
+                <w:szCs w:val="22"/>
+              </w:rPr>
+              <w:t xml:space="preserve">A malicious file is delivered from that site and downloaded onto the endpoint, often without the user clicking anything or ever realizing it happened — for example a compromised legitimate page or a bundled drive-by download.</w:t>
+            </w:r>
+          </w:p>
+          <w:p>
+            <w:pPr>
+              <w:pStyle w:val="ListParagraph"/>
+              <w:numPr>
+                <w:ilvl w:val="0"/>
+                <w:numId w:val="3"/>
+              </w:numPr>
+              <w:spacing w:after="70" w:line="268"/>
+            </w:pPr>
+            <w:r>
+              <w:rPr>
+                <w:sz w:val="22"/>
+                <w:szCs w:val="22"/>
+              </w:rPr>
+              <w:t xml:space="preserve">The file runs and opens an outbound “reverse connection” back to the attacker, handing them remote control of the machine.</w:t>
+            </w:r>
+          </w:p>
+          <w:p>
+            <w:pPr>
+              <w:pStyle w:val="ListParagraph"/>
+              <w:numPr>
+                <w:ilvl w:val="0"/>
+                <w:numId w:val="3"/>
+              </w:numPr>
+              <w:spacing w:after="70" w:line="268"/>
+            </w:pPr>
+            <w:r>
+              <w:rPr>
+                <w:sz w:val="22"/>
+                <w:szCs w:val="22"/>
+              </w:rPr>
+              <w:t xml:space="preserve">Because that outbound destination is new and has never been categorized as malicious, our current default-allow model lets the connection out — the attacker now has a live foothold inside the network, and we find out only after the fact.</w:t>
+            </w:r>
+          </w:p>
+          <w:p>
+            <w:pPr>
+              <w:spacing w:after="0" w:before="40"/>
+            </w:pPr>
+            <w:r>
+              <w:rPr>
+                <w:b/>
+                <w:bCs/>
+                <w:color w:val="C00000"/>
+                <w:sz w:val="22"/>
+                <w:szCs w:val="22"/>
+              </w:rPr>
+              <w:t xml:space="preserve">Category and reputation feeds can only block a destination that has already been identified as bad. They cannot stop a first-time connection to attacker infrastructure nobody has seen before — and that is exactly what a malware reverse connection looks like.</w:t>
+            </w:r>
+          </w:p>
+        </w:tc>
+      </w:tr>
+    </w:tbl>
+    <w:p>
+      <w:pPr>
+        <w:spacing w:after="200"/>
+      </w:pPr>
+    </w:p>
+    <w:p>
+      <w:pPr>
         <w:pStyle w:val="Heading2"/>
         <w:spacing w:after="100" w:before="240"/>
       </w:pPr>
@@ -866,7 +1004,7 @@
           <w:sz w:val="22"/>
           <w:szCs w:val="22"/>
         </w:rPr>
-        <w:t xml:space="preserve">I recommend moving from a default-allow model to a risk-based approach that blocks by default in the categories most associated with malicious activity, and only allows exceptions through a fast, controlled process:</w:t>
+        <w:t xml:space="preserve">The layered improvements below reduce exposure, but on their own they are still built on the same underlying model as today: block what is known, allow everything else. That model can never fully close the scenario above, because it only works once a destination has already been flagged. The only way to close that gap completely is to invert the model for outbound (egress) traffic: deny everything by default, and allow only destinations the business has explicitly approved. Under that model it does not matter whether a reverse-connection destination is brand new or has never been categorized at all — if it is not on the approved list, the connection simply does not go through.</w:t>
       </w:r>
     </w:p>
     <w:p>
@@ -880,10 +1018,19 @@
       </w:pPr>
       <w:r>
         <w:rPr>
-          <w:sz w:val="22"/>
-          <w:szCs w:val="22"/>
-        </w:rPr>
-        <w:t xml:space="preserve">Block newly registered domains (NRDs) for an initial cooling-off period (e.g. 30 days) — one of the strongest, most cost-effective phishing indicators available.</w:t>
+          <w:b/>
+          <w:bCs/>
+          <w:sz w:val="22"/>
+          <w:szCs w:val="22"/>
+        </w:rPr>
+        <w:t xml:space="preserve">Move outbound traffic to a default-deny (allow-list) model: </w:t>
+      </w:r>
+      <w:r>
+        <w:rPr>
+          <w:sz w:val="22"/>
+          <w:szCs w:val="22"/>
+        </w:rPr>
+        <w:t xml:space="preserve">deny all outbound connections except to destinations the business has explicitly approved, so an unknown or first-seen callback — including a malware reverse connection — is blocked automatically, not just sites we already know are bad.</w:t>
       </w:r>
     </w:p>
     <w:p>
@@ -897,10 +1044,19 @@
       </w:pPr>
       <w:r>
         <w:rPr>
-          <w:sz w:val="22"/>
-          <w:szCs w:val="22"/>
-        </w:rPr>
-        <w:t xml:space="preserve">Treat uncategorized/unknown domains as blocked by default rather than allowed, with a simple business-exception request process for legitimate sites that get miscategorized.</w:t>
+          <w:b/>
+          <w:bCs/>
+          <w:sz w:val="22"/>
+          <w:szCs w:val="22"/>
+        </w:rPr>
+        <w:t xml:space="preserve">Roll it out in phases to keep it operationally realistic: </w:t>
+      </w:r>
+      <w:r>
+        <w:rPr>
+          <w:sz w:val="22"/>
+          <w:szCs w:val="22"/>
+        </w:rPr>
+        <w:t xml:space="preserve">start in monitor/log-only mode to build an accurate allow-list from real business traffic, then enforce first on the highest-risk channels — direct-to-IP connections, uncategorized destinations, executable/script downloads — before extending further.</w:t>
       </w:r>
     </w:p>
     <w:p>
@@ -914,10 +1070,19 @@
       </w:pPr>
       <w:r>
         <w:rPr>
-          <w:sz w:val="22"/>
-          <w:szCs w:val="22"/>
-        </w:rPr>
-        <w:t xml:space="preserve">Enable real-time threat-intelligence categories (malware, phishing, botnet C2, anonymizers/proxies) with automatic feed updates, instead of relying only on static category lists.</w:t>
+          <w:b/>
+          <w:bCs/>
+          <w:sz w:val="22"/>
+          <w:szCs w:val="22"/>
+        </w:rPr>
+        <w:t xml:space="preserve">Keep a fast exception path: </w:t>
+      </w:r>
+      <w:r>
+        <w:rPr>
+          <w:sz w:val="22"/>
+          <w:szCs w:val="22"/>
+        </w:rPr>
+        <w:t xml:space="preserve">a simple, quick-turnaround request process so a legitimate new business site can be added to the allow-list without blocking anyone's work.</w:t>
       </w:r>
     </w:p>
     <w:p>
@@ -931,10 +1096,19 @@
       </w:pPr>
       <w:r>
         <w:rPr>
-          <w:sz w:val="22"/>
-          <w:szCs w:val="22"/>
-        </w:rPr>
-        <w:t xml:space="preserve">Add DNS-layer (protective DNS) filtering as a second layer of defense, since web filtering alone can be bypassed at the DNS level.</w:t>
+          <w:b/>
+          <w:bCs/>
+          <w:sz w:val="22"/>
+          <w:szCs w:val="22"/>
+        </w:rPr>
+        <w:t xml:space="preserve">Layer in complementary controls: </w:t>
+      </w:r>
+      <w:r>
+        <w:rPr>
+          <w:sz w:val="22"/>
+          <w:szCs w:val="22"/>
+        </w:rPr>
+        <w:t xml:space="preserve">real-time threat-intelligence categories, newly-registered-domain (NRD) blocking, and DNS-layer (protective DNS) filtering — both as an extra check on allowed traffic and as interim coverage for any channel not yet under full allow-list enforcement.</w:t>
       </w:r>
     </w:p>
     <w:p>
@@ -963,7 +1137,7 @@
           <w:sz w:val="22"/>
           <w:szCs w:val="22"/>
         </w:rPr>
-        <w:t xml:space="preserve">Suggested KPI: percentage reduction in uncategorized-domain traffic reaching endpoints, and average time-to-block for newly identified malicious domains — tracked monthly.</w:t>
+        <w:t xml:space="preserve">Suggested KPI: percentage of outbound traffic covered by the allow-list model, number of blocked attempts to unapproved destinations (including suspected reverse connections), and average time-to-block for newly identified malicious domains on any channel not yet under full enforcement — tracked monthly.</w:t>
       </w:r>
     </w:p>
     <w:p>
@@ -1470,7 +1644,7 @@
                 <w:sz w:val="20"/>
                 <w:szCs w:val="20"/>
               </w:rPr>
-              <w:t xml:space="preserve">Web filtering allows all traffic by default; unknown/new malicious domains are not blocked.</w:t>
+              <w:t xml:space="preserve">Web filtering allows all traffic by default; unknown destinations — including malware reverse connections — are not blocked.</w:t>
             </w:r>
           </w:p>
         </w:tc>
@@ -1498,7 +1672,7 @@
                 <w:sz w:val="20"/>
                 <w:szCs w:val="20"/>
               </w:rPr>
-              <w:t xml:space="preserve">Switch to risk-based default-deny for unknown and newly registered domains; add real-time threat-intel categories and DNS-layer filtering.</w:t>
+              <w:t xml:space="preserve">Move outbound traffic to a default-deny (allow-list) model, phased in by risk channel; layer in real-time threat-intel, NRD blocking, and DNS filtering.</w:t>
             </w:r>
           </w:p>
         </w:tc>
@@ -1735,7 +1909,7 @@
           <w:sz w:val="22"/>
           <w:szCs w:val="22"/>
         </w:rPr>
-        <w:t xml:space="preserve">Both recommendations are low-cost relative to the risk they remove, and both turn an invisible, reactive risk into something we can measure and manage. I'm asking management to approve two things: reconfiguring the web filtering policy to a risk-based, default-deny model for unknown traffic, and signing off on the screen-lock / shared-account policy along with its inclusion in departmental KPIs so IT and HR can begin rollout and reporting next cycle.</w:t>
+        <w:t xml:space="preserve">Both recommendations are low-cost relative to the risk they remove, and both turn an invisible, reactive risk into something we can measure and manage. I'm asking management to approve two things: moving outbound web traffic to a default-deny (allow-list) model, phased in by risk channel so it doesn't disrupt the business, and signing off on the screen-lock / shared-account policy along with its inclusion in departmental KPIs so IT and HR can begin rollout and reporting next cycle.</w:t>
       </w:r>
     </w:p>
     <w:p>
@@ -2007,6 +2181,18 @@
       </w:pPr>
     </w:lvl>
   </w:abstractNum>
+  <w:abstractNum w:abstractNumId="3" w15:restartNumberingAfterBreak="0">
+    <w:multiLevelType w:val="hybridMultilevel"/>
+    <w:lvl w:ilvl="0" w15:tentative="1">
+      <w:start w:val="1"/>
+      <w:numFmt w:val="decimal"/>
+      <w:lvlText w:val="%1."/>
+      <w:lvlJc w:val="left"/>
+      <w:pPr>
+        <w:ind w:left="460" w:hanging="260"/>
+      </w:pPr>
+    </w:lvl>
+  </w:abstractNum>
   <w:num w:numId="1">
     <w:abstractNumId w:val="1"/>
     <w:lvlOverride w:ilvl="0">
@@ -2015,6 +2201,12 @@
   </w:num>
   <w:num w:numId="2">
     <w:abstractNumId w:val="2"/>
+    <w:lvlOverride w:ilvl="0">
+      <w:startOverride w:val="1"/>
+    </w:lvlOverride>
+  </w:num>
+  <w:num w:numId="3">
+    <w:abstractNumId w:val="3"/>
     <w:lvlOverride w:ilvl="0">
       <w:startOverride w:val="1"/>
     </w:lvlOverride>

</xml_diff>